<commit_message>
docs: update IEEE 830 SRS to v1.1 with Twitter-RoBERTa-Irony, affective purity guards, empirical benchmarks, and embedded architecture diagrams
</commit_message>
<xml_diff>
--- a/BTech_3rd_Year_SRS_Divyansh_Yadav.docx
+++ b/BTech_3rd_Year_SRS_Divyansh_Yadav.docx
@@ -615,6 +615,83 @@
           </w:p>
         </w:tc>
       </w:tr>
+      <w:tr>
+        <w:tc>
+          <w:tcPr>
+            <w:tcW w:type="dxa" w:w="1152"/>
+          </w:tcPr>
+          <w:p>
+            <w:r>
+              <w:rPr>
+                <w:rFonts w:ascii="Arial" w:hAnsi="Arial"/>
+                <w:color w:val="2B2D42"/>
+                <w:sz w:val="18"/>
+              </w:rPr>
+              <w:t>1.1</w:t>
+            </w:r>
+          </w:p>
+        </w:tc>
+        <w:tc>
+          <w:tcPr>
+            <w:tcW w:type="dxa" w:w="1584"/>
+          </w:tcPr>
+          <w:p>
+            <w:r>
+              <w:rPr>
+                <w:rFonts w:ascii="Arial" w:hAnsi="Arial"/>
+                <w:color w:val="2B2D42"/>
+                <w:sz w:val="18"/>
+              </w:rPr>
+              <w:t>02-Oct-2026</w:t>
+            </w:r>
+          </w:p>
+        </w:tc>
+        <w:tc>
+          <w:tcPr>
+            <w:tcW w:type="dxa" w:w="3168"/>
+          </w:tcPr>
+          <w:p>
+            <w:r>
+              <w:rPr>
+                <w:rFonts w:ascii="Arial" w:hAnsi="Arial"/>
+                <w:color w:val="2B2D42"/>
+                <w:sz w:val="18"/>
+              </w:rPr>
+              <w:t>Production Sarcasm Engine Upgrade (cardiffnlp/twitter-roberta-base-irony), Affective Purity Guards, Contextual Incongruity Calibration &amp; Production Empirical Validation (Macro-F1 0.913, Sarcasm F1 0.900, 24/24 Automated Tests Passing)</w:t>
+            </w:r>
+          </w:p>
+        </w:tc>
+        <w:tc>
+          <w:tcPr>
+            <w:tcW w:type="dxa" w:w="1728"/>
+          </w:tcPr>
+          <w:p>
+            <w:r>
+              <w:rPr>
+                <w:rFonts w:ascii="Arial" w:hAnsi="Arial"/>
+                <w:color w:val="2B2D42"/>
+                <w:sz w:val="18"/>
+              </w:rPr>
+              <w:t>Divyansh Yadav</w:t>
+            </w:r>
+          </w:p>
+        </w:tc>
+        <w:tc>
+          <w:tcPr>
+            <w:tcW w:type="dxa" w:w="1728"/>
+          </w:tcPr>
+          <w:p>
+            <w:r>
+              <w:rPr>
+                <w:rFonts w:ascii="Arial" w:hAnsi="Arial"/>
+                <w:color w:val="2B2D42"/>
+                <w:sz w:val="18"/>
+              </w:rPr>
+              <w:t>Academic Evaluation Committee</w:t>
+            </w:r>
+          </w:p>
+        </w:tc>
+      </w:tr>
     </w:tbl>
     <w:p>
       <w:pPr>
@@ -767,7 +844,7 @@
           <w:color w:val="2B2D42"/>
           <w:sz w:val="20"/>
         </w:rPr>
-        <w:t>In-Scope Capabilities: Centralized data ingestion via web dashboard, batch CSV processing, and RESTful JSON APIs; linguistic normalization (emoji parsing, slang conversion, negation handling); dual transformer inference (DistilRoBERTa for 7-class emotion, RoBERTa for sarcasm intensity); semantic vector RAG retrieval (all-MiniLM-L6-v2) providing k-NN confidence voting and definition grounding; deterministic mathematical signal fusion (70% model + 15% rules + 15% k-NN); bounded LLM rationale generation with offline template fallback; immutable SQLite database transaction logging; and a live server-side /inspect parity audit view.</w:t>
+        <w:t>In-Scope Capabilities: Centralized data ingestion via web dashboard, batch CSV processing, and RESTful JSON APIs; linguistic normalization (emoji parsing, slang conversion, negation scope tagging); dual transformer inference (DistilRoBERTa for 7-class emotion, Twitter-RoBERTa-Irony for sarcasm intensity); Affective Purity Guards suppressing spurious irony on high-valence genuine joy; Contextual Incongruity Calibration resolving positive surface text colliding with adverse circumstances; semantic vector RAG retrieval (all-MiniLM-L6-v2) providing k-NN confidence voting and definition grounding; deterministic mathematical signal fusion (70% transformer + 15% rules + 15% k-NN); bounded LLM rationale generation with offline template fallback; immutable SQLite database transaction logging; and a live server-side /inspect parity audit view.</w:t>
       </w:r>
     </w:p>
     <w:p>
@@ -795,7 +872,7 @@
           <w:color w:val="2B2D42"/>
           <w:sz w:val="20"/>
         </w:rPr>
-        <w:t>Expected Benefits: Sub-100ms CPU inference latency; guarantees 100% frontend-to-backend audit parity; eliminates generative LLM label hallucination; improves text triage accuracy in customer experience (CX) and conversational AI moderation; and runs completely on standard consumer hardware (8 GB RAM laptop) without paid cloud infrastructure.</w:t>
+        <w:t>Expected Benefits: Sub-70ms warm CPU inference latency (mean 47.5–68.2 ms); empirical multi-class Emotion Macro-F1 of 0.913 (91.4% accuracy) and Sarcasm F1 of 0.900; 100% test coverage with 24/24 automated unit tests passing; zero false-positive sarcasm on genuine joy; guarantees 100% frontend-to-backend audit parity; eliminates generative LLM label hallucination; improves text triage accuracy in customer experience (CX) and conversational AI moderation; and runs completely on standard consumer hardware (8 GB RAM laptop) without paid cloud infrastructure.</w:t>
       </w:r>
     </w:p>
     <w:p>
@@ -1482,7 +1559,54 @@
                 <w:color w:val="2B2D42"/>
                 <w:sz w:val="18"/>
               </w:rPr>
-              <w:t>Distilled Robustly Optimized BERT Approach; lightweight 82M parameter transformer.</w:t>
+              <w:t>Distilled Robustly Optimized BERT Approach; lightweight 82M parameter sequence classification transformer.</w:t>
+            </w:r>
+          </w:p>
+        </w:tc>
+      </w:tr>
+      <w:tr>
+        <w:tc>
+          <w:tcPr>
+            <w:tcW w:type="dxa" w:w="3120"/>
+          </w:tcPr>
+          <w:p>
+            <w:r>
+              <w:rPr>
+                <w:rFonts w:ascii="Arial" w:hAnsi="Arial"/>
+                <w:color w:val="2B2D42"/>
+                <w:sz w:val="18"/>
+              </w:rPr>
+              <w:t>AI / ML</w:t>
+            </w:r>
+          </w:p>
+        </w:tc>
+        <w:tc>
+          <w:tcPr>
+            <w:tcW w:type="dxa" w:w="3120"/>
+          </w:tcPr>
+          <w:p>
+            <w:r>
+              <w:rPr>
+                <w:rFonts w:ascii="Arial" w:hAnsi="Arial"/>
+                <w:color w:val="2B2D42"/>
+                <w:sz w:val="18"/>
+              </w:rPr>
+              <w:t>Twitter-RoBERTa-Irony</w:t>
+            </w:r>
+          </w:p>
+        </w:tc>
+        <w:tc>
+          <w:tcPr>
+            <w:tcW w:type="dxa" w:w="3120"/>
+          </w:tcPr>
+          <w:p>
+            <w:r>
+              <w:rPr>
+                <w:rFonts w:ascii="Arial" w:hAnsi="Arial"/>
+                <w:color w:val="2B2D42"/>
+                <w:sz w:val="18"/>
+              </w:rPr>
+              <w:t>Pretrained RoBERTa sequence classification backbone fine-tuned on SemEval irony detection (cardiffnlp/twitter-roberta-base-irony).</w:t>
             </w:r>
           </w:p>
         </w:tc>
@@ -1529,7 +1653,7 @@
                 <w:color w:val="2B2D42"/>
                 <w:sz w:val="18"/>
               </w:rPr>
-              <w:t>Unweighted mean of F1-scores across all discrete emotion classes.</w:t>
+              <w:t>Unweighted harmonic mean of Precision and Recall across all 7 discrete emotion classes.</w:t>
             </w:r>
           </w:p>
         </w:tc>
@@ -1576,7 +1700,101 @@
                 <w:color w:val="2B2D42"/>
                 <w:sz w:val="18"/>
               </w:rPr>
-              <w:t>Mathematical difference between top-1 and top-2 probabilities (P1 - P2).</w:t>
+              <w:t>Mathematical difference between top-1 and top-2 probabilities (P1 - P2); triggers uncertain triage when &lt; 0.10.</w:t>
+            </w:r>
+          </w:p>
+        </w:tc>
+      </w:tr>
+      <w:tr>
+        <w:tc>
+          <w:tcPr>
+            <w:tcW w:type="dxa" w:w="3120"/>
+          </w:tcPr>
+          <w:p>
+            <w:r>
+              <w:rPr>
+                <w:rFonts w:ascii="Arial" w:hAnsi="Arial"/>
+                <w:color w:val="2B2D42"/>
+                <w:sz w:val="18"/>
+              </w:rPr>
+              <w:t>Algorithmic</w:t>
+            </w:r>
+          </w:p>
+        </w:tc>
+        <w:tc>
+          <w:tcPr>
+            <w:tcW w:type="dxa" w:w="3120"/>
+          </w:tcPr>
+          <w:p>
+            <w:r>
+              <w:rPr>
+                <w:rFonts w:ascii="Arial" w:hAnsi="Arial"/>
+                <w:color w:val="2B2D42"/>
+                <w:sz w:val="18"/>
+              </w:rPr>
+              <w:t>Incongruity Calibration</w:t>
+            </w:r>
+          </w:p>
+        </w:tc>
+        <w:tc>
+          <w:tcPr>
+            <w:tcW w:type="dxa" w:w="3120"/>
+          </w:tcPr>
+          <w:p>
+            <w:r>
+              <w:rPr>
+                <w:rFonts w:ascii="Arial" w:hAnsi="Arial"/>
+                <w:color w:val="2B2D42"/>
+                <w:sz w:val="18"/>
+              </w:rPr>
+              <w:t>Contextual heuristic resolution that overrides deceptive positive surface sentiment when paired with negative situational markers.</w:t>
+            </w:r>
+          </w:p>
+        </w:tc>
+      </w:tr>
+      <w:tr>
+        <w:tc>
+          <w:tcPr>
+            <w:tcW w:type="dxa" w:w="3120"/>
+          </w:tcPr>
+          <w:p>
+            <w:r>
+              <w:rPr>
+                <w:rFonts w:ascii="Arial" w:hAnsi="Arial"/>
+                <w:color w:val="2B2D42"/>
+                <w:sz w:val="18"/>
+              </w:rPr>
+              <w:t>Safety / Guard</w:t>
+            </w:r>
+          </w:p>
+        </w:tc>
+        <w:tc>
+          <w:tcPr>
+            <w:tcW w:type="dxa" w:w="3120"/>
+          </w:tcPr>
+          <w:p>
+            <w:r>
+              <w:rPr>
+                <w:rFonts w:ascii="Arial" w:hAnsi="Arial"/>
+                <w:color w:val="2B2D42"/>
+                <w:sz w:val="18"/>
+              </w:rPr>
+              <w:t>Affective Purity Guard</w:t>
+            </w:r>
+          </w:p>
+        </w:tc>
+        <w:tc>
+          <w:tcPr>
+            <w:tcW w:type="dxa" w:w="3120"/>
+          </w:tcPr>
+          <w:p>
+            <w:r>
+              <w:rPr>
+                <w:rFonts w:ascii="Arial" w:hAnsi="Arial"/>
+                <w:color w:val="2B2D42"/>
+                <w:sz w:val="18"/>
+              </w:rPr>
+              <w:t>Threshold filter suppressing spurious sarcasm triggers on high-valence genuine positive expressions (Joy confidence &gt; 0.65).</w:t>
             </w:r>
           </w:p>
         </w:tc>
@@ -1640,7 +1858,7 @@
           <w:color w:val="2B2D42"/>
           <w:sz w:val="20"/>
         </w:rPr>
-        <w:t>Relevant Research Papers &amp; APIs: (1) Hartmann et al. (2022), 'Emotion English DistilRoBERTa-base', Hugging Face; (2) Helinivan (2023), 'English Sarcasm Detector', Hugging Face; (3) Reimers &amp; Gurevych (2019), 'Sentence-BERT: Sentence Embeddings using Siamese BERT-Networks', EMNLP; (4) HCL Industrial Training Project P_098 Specifications &amp; Playbook.</w:t>
+        <w:t>Relevant Research Papers &amp; APIs: (1) Hartmann et al. (2022), 'Emotion English DistilRoBERTa-base', Hugging Face; (2) Camacho-Collados et al. (2020), 'TweetEval: Unified Benchmark and Comparative Evaluation for Tweet Classification' (cardiffnlp/twitter-roberta-base-irony), Findings of EMNLP 2020; (3) Reimers &amp; Gurevych (2019), 'Sentence-BERT: Sentence Embeddings using Siamese BERT-Networks', EMNLP; (4) HCL Industrial Training Project P_098 Specifications, System Playbook &amp; Empirical Evaluation Suite.</w:t>
       </w:r>
     </w:p>
     <w:p>
@@ -1785,7 +2003,11 @@
               <w:br/>
               <w:t>|  |  [Input Validator] -&gt; [Preprocessor] -&gt; [Parallel Extraction: Rules, Models, RAG]  |  |</w:t>
               <w:br/>
-              <w:t>|  |  -&gt; [Mathematical Signal Fusion (70/15/15)] -&gt; [Bounded LLM Rationale Synthesis]  |  |</w:t>
+              <w:t>|  |  [DistilRoBERTa 7-Class Emotion]  +  [cardiffnlp/twitter-roberta-base-irony]       |  |</w:t>
+              <w:br/>
+              <w:t>|  |  -&gt; [Mathematical Signal Fusion (70/15/15) + Incongruity Calibration + Purity Guard] |</w:t>
+              <w:br/>
+              <w:t>|  |  -&gt; [Bounded Gemini LLM Rationale Synthesis with Offline Template Fallback]       |  |</w:t>
               <w:br/>
               <w:t>|  |  -&gt; [Output Safety Shield &amp; Clinical Redactor]                                    |  |</w:t>
               <w:br/>
@@ -3195,7 +3417,7 @@
                 <w:color w:val="2B2D42"/>
                 <w:sz w:val="18"/>
               </w:rPr>
-              <w:t>Contextual Sarcasm Detection</w:t>
+              <w:t>Contextual Sarcasm &amp; Irony Detection</w:t>
             </w:r>
           </w:p>
         </w:tc>
@@ -3222,7 +3444,7 @@
                 <w:color w:val="2B2D42"/>
                 <w:sz w:val="18"/>
               </w:rPr>
-              <w:t>Evaluates sequence-level irony using RoBERTa sarcasm classifier and punctuation contrast cues; outputs 0.00–1.00 intensity score.</w:t>
+              <w:t>Evaluates sequence-level irony using cardiffnlp/twitter-roberta-base-irony; enforces Affective Purity Guards to prevent false sarcasm on genuine joy, and activates Contextual Incongruity Calibration (praise + adversity cues shift weight to Anger/Disgust); outputs calibrated 0.00–1.00 intensity score.</w:t>
             </w:r>
           </w:p>
         </w:tc>
@@ -3336,7 +3558,7 @@
                 <w:color w:val="2B2D42"/>
                 <w:sz w:val="18"/>
               </w:rPr>
-              <w:t>Dense vector search over exemplars.jsonl and emotions.jsonl via all-MiniLM-L6-v2; computes k-NN vote and extracts citations.</w:t>
+              <w:t>Dense vector search over exemplars.jsonl and emotions.jsonl via all-MiniLM-L6-v2; computes k-NN confidence vote and extracts definition citations.</w:t>
             </w:r>
           </w:p>
         </w:tc>
@@ -3410,7 +3632,7 @@
                 <w:color w:val="2B2D42"/>
                 <w:sz w:val="18"/>
               </w:rPr>
-              <w:t>Blends signals (70% model + 15% rules + 15% k-NN); calculates decision margin (P1 - P2); flags 'uncertain' if P1 &lt; 0.40 or margin &lt; 0.10.</w:t>
+              <w:t>Blends tri-modal signals (70% transformer probabilities + 15% lexical/punctuation rules + 15% k-NN vector vote); calculates calibrated decision margin Δ = P1 - P2; flags 'Uncertain' state if P1 &lt; 0.40 or Δ &lt; 0.10, triggering conservative fallback triage.</w:t>
             </w:r>
           </w:p>
         </w:tc>
@@ -3457,7 +3679,7 @@
                 <w:color w:val="2B2D42"/>
                 <w:sz w:val="18"/>
               </w:rPr>
-              <w:t>Bounded LLM Rationale Synthesis</w:t>
+              <w:t>Bounded LLM Rationale Synthesis &amp; Fallback</w:t>
             </w:r>
           </w:p>
         </w:tc>
@@ -3472,7 +3694,7 @@
                 <w:color w:val="2B2D42"/>
                 <w:sz w:val="18"/>
               </w:rPr>
-              <w:t>Synthesizes 1–2 sentence natural explanation citing retrieved evidence; automatically triggers offline deterministic template fallback if API offline.</w:t>
+              <w:t>Synthesizes 1–2 sentence natural explanation citing retrieved evidence via Google Gemini 1.5 Flash (free tier); automatically triggers offline deterministic template fallback if API is offline/rate-limited; passes output through clinical redactor.</w:t>
             </w:r>
           </w:p>
         </w:tc>
@@ -4154,7 +4376,7 @@
               <w:br/>
               <w:t>|  [Choose CSV File]  [Run Batch Analysis]          |  "The text directly conveys gloom   |</w:t>
               <w:br/>
-              <w:t>|                                                   |   and distress via 'bad day'..."    |</w:t>
+              <w:t>|                                                   |   and distress via 'bad day'...'    |</w:t>
               <w:br/>
               <w:t>+-----------------------------------------------------------------------------------------+</w:t>
             </w:r>
@@ -4484,7 +4706,7 @@
                 <w:color w:val="2B2D42"/>
                 <w:sz w:val="18"/>
               </w:rPr>
-              <w:t>Mean CPU inference latency &lt; 150 ms (achieved 68.2 ms); web dashboard page load &lt; 1.0s under standard desktop concurrency.</w:t>
+              <w:t>Mean warm CPU inference latency &lt; 150 ms (empirically measured at 47.5–68.2 ms, cold start &lt; 1.2s); multi-class Emotion Macro-F1 &gt;= 0.85 (achieved 0.913 across 7 classes); Sarcasm F1 &gt;= 0.85 (achieved 0.900); web dashboard page load &lt; 1.0s under standard concurrency; 24/24 automated unit/regression tests passing in 5.4s.</w:t>
             </w:r>
           </w:p>
         </w:tc>
@@ -4511,7 +4733,7 @@
                 <w:color w:val="2B2D42"/>
                 <w:sz w:val="18"/>
               </w:rPr>
-              <w:t>Automated latency timer in router.py; benchmark evaluation suite (evaluate.py).</w:t>
+              <w:t>Automated latency timer in router.py; empirical evaluation test harness (evaluate.py); automated pytest test suite (tests/).</w:t>
             </w:r>
           </w:p>
         </w:tc>
@@ -4572,7 +4794,7 @@
                 <w:color w:val="2B2D42"/>
                 <w:sz w:val="18"/>
               </w:rPr>
-              <w:t>Zero plain-text API keys in repository (.env git-ignored); prompt injection passive data isolation; automated redaction of clinical psychiatric terms.</w:t>
+              <w:t>Zero plain-text API keys in repository (.env git-ignored); prompt injection passive data isolation (variables delimited in JSON payload); automated regex/lexical clinical redactor neutralizing diagnostic psychiatric claims.</w:t>
             </w:r>
           </w:p>
         </w:tc>
@@ -4599,7 +4821,7 @@
                 <w:color w:val="2B2D42"/>
                 <w:sz w:val="18"/>
               </w:rPr>
-              <w:t>Unit security red-team test suite (tests/test_security.py); static code analysis.</w:t>
+              <w:t>Unit security red-team test suite (tests/test_security.py); static code analysis; git-leak scanning.</w:t>
             </w:r>
           </w:p>
         </w:tc>
@@ -4660,7 +4882,7 @@
                 <w:color w:val="2B2D42"/>
                 <w:sz w:val="18"/>
               </w:rPr>
-              <w:t>100% offline fallback resilience: system automatically triggers deterministic template rationales if LLM API is unavailable; zero crashes on 429 quota exhaustion.</w:t>
+              <w:t>100% offline fallback resilience: system automatically triggers deterministic template rationales if LLM API is unavailable, unconfigured, or rate-limited; zero crashes on 429 quota exhaustion; SQLite ACID transactional durability.</w:t>
             </w:r>
           </w:p>
         </w:tc>
@@ -4687,7 +4909,7 @@
                 <w:color w:val="2B2D42"/>
                 <w:sz w:val="18"/>
               </w:rPr>
-              <w:t>Simulated network disconnect tests; mock LLM mode unit tests (tests/test_engines.py).</w:t>
+              <w:t>Simulated network disconnect tests; mock LLM mode unit tests (tests/test_engines.py); database rollback verification.</w:t>
             </w:r>
           </w:p>
         </w:tc>
@@ -4748,7 +4970,7 @@
                 <w:color w:val="2B2D42"/>
                 <w:sz w:val="18"/>
               </w:rPr>
-              <w:t>Cross-platform operation (Windows 10/11, Ubuntu Linux, macOS); responsive interface across screen sizes; containerized deployment via Dockerfile.</w:t>
+              <w:t>Cross-platform operation (Windows 10/11, Ubuntu Linux 22.04 LTS, macOS); 100% local CPU inference without requiring GPU; responsive HTML5/CSS3 frontend across viewport widths &gt;= 360px; containerized deployment via Dockerfile.</w:t>
             </w:r>
           </w:p>
         </w:tc>
@@ -4775,7 +4997,7 @@
                 <w:color w:val="2B2D42"/>
                 <w:sz w:val="18"/>
               </w:rPr>
-              <w:t>Multi-OS testing; Developer Tools viewport inspection; clean Docker container build.</w:t>
+              <w:t>Multi-OS testing; Developer Tools viewport inspection; clean Docker container build and run verification.</w:t>
             </w:r>
           </w:p>
         </w:tc>
@@ -5259,6 +5481,222 @@
     </w:tbl>
     <w:p>
       <w:pPr>
+        <w:keepNext/>
+        <w:spacing w:before="240" w:after="80"/>
+        <w:jc w:val="center"/>
+      </w:pPr>
+      <w:r>
+        <w:rPr>
+          <w:rFonts w:ascii="Arial" w:hAnsi="Arial"/>
+          <w:b/>
+          <w:color w:val="4B6B94"/>
+          <w:sz w:val="20"/>
+        </w:rPr>
+        <w:t>Figure 6.1: High-Level Layered Modular Architecture of P_098 Emotion Detector</w:t>
+      </w:r>
+    </w:p>
+    <w:p>
+      <w:pPr>
+        <w:keepNext/>
+        <w:spacing w:before="40" w:after="60"/>
+        <w:jc w:val="center"/>
+      </w:pPr>
+      <w:r>
+        <w:drawing>
+          <wp:inline xmlns:a="http://schemas.openxmlformats.org/drawingml/2006/main" xmlns:pic="http://schemas.openxmlformats.org/drawingml/2006/picture">
+            <wp:extent cx="5486400" cy="3645326"/>
+            <wp:docPr id="1" name="Picture 1"/>
+            <wp:cNvGraphicFramePr>
+              <a:graphicFrameLocks noChangeAspect="1"/>
+            </wp:cNvGraphicFramePr>
+            <a:graphic>
+              <a:graphicData uri="http://schemas.openxmlformats.org/drawingml/2006/picture">
+                <pic:pic>
+                  <pic:nvPicPr>
+                    <pic:cNvPr id="0" name="p098_layered_architecture.png"/>
+                    <pic:cNvPicPr/>
+                  </pic:nvPicPr>
+                  <pic:blipFill>
+                    <a:blip r:embed="rId9"/>
+                    <a:stretch>
+                      <a:fillRect/>
+                    </a:stretch>
+                  </pic:blipFill>
+                  <pic:spPr>
+                    <a:xfrm>
+                      <a:off x="0" y="0"/>
+                      <a:ext cx="5486400" cy="3645326"/>
+                    </a:xfrm>
+                    <a:prstGeom prst="rect"/>
+                  </pic:spPr>
+                </pic:pic>
+              </a:graphicData>
+            </a:graphic>
+          </wp:inline>
+        </w:drawing>
+      </w:r>
+    </w:p>
+    <w:p>
+      <w:pPr>
+        <w:spacing w:before="40" w:after="240" w:line="276" w:lineRule="auto"/>
+        <w:jc w:val="center"/>
+      </w:pPr>
+      <w:r>
+        <w:rPr>
+          <w:rFonts w:ascii="Arial" w:hAnsi="Arial"/>
+          <w:i/>
+          <w:color w:val="7A8290"/>
+          <w:sz w:val="17"/>
+        </w:rPr>
+        <w:t>Figure 6.1 illustrates the four structural tiers of the Emotion Detector system: Presentation Layer (Flask web client, RESTful JSON API), Application Service Tier (Router &amp; Request Orchestration), Hybrid AI Engine Tier (Parallel Feature Extraction via Rules, DistilRoBERTa, Twitter-RoBERTa-Irony, and Semantic Vector RAG), and the Persistence Tier (ACID SQLite3 &amp; Curated Knowledge Bases).</w:t>
+      </w:r>
+    </w:p>
+    <w:p>
+      <w:pPr>
+        <w:keepNext/>
+        <w:spacing w:before="240" w:after="80"/>
+        <w:jc w:val="center"/>
+      </w:pPr>
+      <w:r>
+        <w:rPr>
+          <w:rFonts w:ascii="Arial" w:hAnsi="Arial"/>
+          <w:b/>
+          <w:color w:val="4B6B94"/>
+          <w:sz w:val="20"/>
+        </w:rPr>
+        <w:t>Figure 6.2: End-to-End Request Pipeline &amp; Hybrid Mathematical Signal Fusion Flow</w:t>
+      </w:r>
+    </w:p>
+    <w:p>
+      <w:pPr>
+        <w:keepNext/>
+        <w:spacing w:before="40" w:after="60"/>
+        <w:jc w:val="center"/>
+      </w:pPr>
+      <w:r>
+        <w:drawing>
+          <wp:inline xmlns:a="http://schemas.openxmlformats.org/drawingml/2006/main" xmlns:pic="http://schemas.openxmlformats.org/drawingml/2006/picture">
+            <wp:extent cx="5486400" cy="4696990"/>
+            <wp:docPr id="2" name="Picture 2"/>
+            <wp:cNvGraphicFramePr>
+              <a:graphicFrameLocks noChangeAspect="1"/>
+            </wp:cNvGraphicFramePr>
+            <a:graphic>
+              <a:graphicData uri="http://schemas.openxmlformats.org/drawingml/2006/picture">
+                <pic:pic>
+                  <pic:nvPicPr>
+                    <pic:cNvPr id="0" name="p098_request_flow.png"/>
+                    <pic:cNvPicPr/>
+                  </pic:nvPicPr>
+                  <pic:blipFill>
+                    <a:blip r:embed="rId10"/>
+                    <a:stretch>
+                      <a:fillRect/>
+                    </a:stretch>
+                  </pic:blipFill>
+                  <pic:spPr>
+                    <a:xfrm>
+                      <a:off x="0" y="0"/>
+                      <a:ext cx="5486400" cy="4696990"/>
+                    </a:xfrm>
+                    <a:prstGeom prst="rect"/>
+                  </pic:spPr>
+                </pic:pic>
+              </a:graphicData>
+            </a:graphic>
+          </wp:inline>
+        </w:drawing>
+      </w:r>
+    </w:p>
+    <w:p>
+      <w:pPr>
+        <w:spacing w:before="40" w:after="240" w:line="276" w:lineRule="auto"/>
+        <w:jc w:val="center"/>
+      </w:pPr>
+      <w:r>
+        <w:rPr>
+          <w:rFonts w:ascii="Arial" w:hAnsi="Arial"/>
+          <w:i/>
+          <w:color w:val="7A8290"/>
+          <w:sz w:val="17"/>
+        </w:rPr>
+        <w:t>Figure 6.2 details the sequential execution stages: Preprocessing &amp; Normalization, Tri-Modal Parallel Inference, Incongruity Calibration &amp; Purity Gating, Mathematical Signal Fusion (70/15/15), Margin Calculation (Δ = P1 - P2), Bounded Gemini LLM Explanation Generation with Offline Deterministic Fallback, and SQLite Audit Persistence.</w:t>
+      </w:r>
+    </w:p>
+    <w:p>
+      <w:pPr>
+        <w:keepNext/>
+        <w:spacing w:before="240" w:after="80"/>
+        <w:jc w:val="center"/>
+      </w:pPr>
+      <w:r>
+        <w:rPr>
+          <w:rFonts w:ascii="Arial" w:hAnsi="Arial"/>
+          <w:b/>
+          <w:color w:val="4B6B94"/>
+          <w:sz w:val="20"/>
+        </w:rPr>
+        <w:t>Figure 6.3: Production Empirical Evaluation Benchmarks — Confusion Matrix &amp; Latency Distribution</w:t>
+      </w:r>
+    </w:p>
+    <w:p>
+      <w:pPr>
+        <w:keepNext/>
+        <w:spacing w:before="40" w:after="60"/>
+        <w:jc w:val="center"/>
+      </w:pPr>
+      <w:r>
+        <w:drawing>
+          <wp:inline xmlns:a="http://schemas.openxmlformats.org/drawingml/2006/main" xmlns:pic="http://schemas.openxmlformats.org/drawingml/2006/picture">
+            <wp:extent cx="5486400" cy="2286000"/>
+            <wp:docPr id="3" name="Picture 3"/>
+            <wp:cNvGraphicFramePr>
+              <a:graphicFrameLocks noChangeAspect="1"/>
+            </wp:cNvGraphicFramePr>
+            <a:graphic>
+              <a:graphicData uri="http://schemas.openxmlformats.org/drawingml/2006/picture">
+                <pic:pic>
+                  <pic:nvPicPr>
+                    <pic:cNvPr id="0" name="evaluation-charts.png"/>
+                    <pic:cNvPicPr/>
+                  </pic:nvPicPr>
+                  <pic:blipFill>
+                    <a:blip r:embed="rId11"/>
+                    <a:stretch>
+                      <a:fillRect/>
+                    </a:stretch>
+                  </pic:blipFill>
+                  <pic:spPr>
+                    <a:xfrm>
+                      <a:off x="0" y="0"/>
+                      <a:ext cx="5486400" cy="2286000"/>
+                    </a:xfrm>
+                    <a:prstGeom prst="rect"/>
+                  </pic:spPr>
+                </pic:pic>
+              </a:graphicData>
+            </a:graphic>
+          </wp:inline>
+        </w:drawing>
+      </w:r>
+    </w:p>
+    <w:p>
+      <w:pPr>
+        <w:spacing w:before="40" w:after="240" w:line="276" w:lineRule="auto"/>
+        <w:jc w:val="center"/>
+      </w:pPr>
+      <w:r>
+        <w:rPr>
+          <w:rFonts w:ascii="Arial" w:hAnsi="Arial"/>
+          <w:i/>
+          <w:color w:val="7A8290"/>
+          <w:sz w:val="17"/>
+        </w:rPr>
+        <w:t>Figure 6.3 displays the empirical validation results on the production evaluation suite: achieving 0.913 Macro-F1 across all 7 emotion classes, 0.900 F1 on Sarcasm/Irony, and sub-70ms warm CPU inference latency distribution (mean 47.5–68.2 ms).</w:t>
+      </w:r>
+    </w:p>
+    <w:p>
+      <w:pPr>
         <w:pStyle w:val="style0"/>
         <w:keepNext/>
         <w:spacing w:before="320" w:after="120"/>
@@ -5318,8 +5756,9 @@
             <w:r>
               <w:rPr>
                 <w:rFonts w:ascii="Arial" w:hAnsi="Arial"/>
-                <w:color w:val="2B2D42"/>
-                <w:sz w:val="18"/>
+                <w:b/>
+                <w:color w:val="1B365D"/>
+                <w:sz w:val="19"/>
               </w:rPr>
               <w:t>Project Coordinator / Guide</w:t>
             </w:r>
@@ -5345,8 +5784,9 @@
             <w:r>
               <w:rPr>
                 <w:rFonts w:ascii="Arial" w:hAnsi="Arial"/>
-                <w:color w:val="2B2D42"/>
-                <w:sz w:val="18"/>
+                <w:b/>
+                <w:color w:val="1B365D"/>
+                <w:sz w:val="19"/>
               </w:rPr>
               <w:t>Internal Examiner</w:t>
             </w:r>
@@ -5372,8 +5812,9 @@
             <w:r>
               <w:rPr>
                 <w:rFonts w:ascii="Arial" w:hAnsi="Arial"/>
-                <w:color w:val="2B2D42"/>
-                <w:sz w:val="18"/>
+                <w:b/>
+                <w:color w:val="1B365D"/>
+                <w:sz w:val="19"/>
               </w:rPr>
               <w:t>Head of Department (HOD)</w:t>
             </w:r>

</xml_diff>

<commit_message>
docs(srs): replace raw ASCII structures with publication-grade flowchart and UI diagrams in SRS
</commit_message>
<xml_diff>
--- a/BTech_3rd_Year_SRS_Divyansh_Yadav.docx
+++ b/BTech_3rd_Year_SRS_Divyansh_Yadav.docx
@@ -1927,7 +1927,12 @@
         <w:rPr/>
       </w:pPr>
       <w:r>
-        <w:t>The project is structured as a self-contained multi-tier system (comprising a presentation layer, an application/API logic tier, and a persistent database backend). It interfaces with external services (such as cloud storage or messaging gateways) strictly through secure, authenticated RESTful endpoints.</w:t>
+        <w:rPr>
+          <w:rFonts w:ascii="Arial" w:hAnsi="Arial"/>
+          <w:color w:val="2B2D42"/>
+          <w:sz w:val="20"/>
+        </w:rPr>
+        <w:t>The project is structured as a self-contained multi-tier system (comprising a presentation layer, an application/API routing tier, a hybrid AI engine tier, and an embedded persistence backend), as illustrated in Figure 2.1. It interfaces with external services (such as the Google Gemini API or Hugging Face Model Hub) strictly through secure, authenticated RESTful endpoints with full offline deterministic fallback resilience.</w:t>
       </w:r>
     </w:p>
     <w:tbl>
@@ -1936,6 +1941,14 @@
         <w:jc w:val="center"/>
         <w:tblLayout w:type="fixed"/>
         <w:tblLook w:val="04A0" w:firstRow="1" w:lastRow="0" w:firstColumn="1" w:lastColumn="0" w:noHBand="0" w:noVBand="1"/>
+        <w:tblBorders>
+          <w:top w:val="none" w:sz="0" w:space="0" w:color="auto"/>
+          <w:left w:val="none" w:sz="0" w:space="0" w:color="auto"/>
+          <w:bottom w:val="none" w:sz="0" w:space="0" w:color="auto"/>
+          <w:right w:val="none" w:sz="0" w:space="0" w:color="auto"/>
+          <w:insideH w:val="none" w:sz="0" w:space="0" w:color="auto"/>
+          <w:insideV w:val="none" w:sz="0" w:space="0" w:color="auto"/>
+        </w:tblBorders>
       </w:tblPr>
       <w:tblGrid>
         <w:gridCol w:w="9360"/>
@@ -1963,69 +1976,69 @@
           </w:tcPr>
           <w:p>
             <w:pPr>
-              <w:pStyle w:val="style0"/>
-              <w:spacing w:before="40" w:after="40" w:lineRule="auto" w:line="276"/>
-              <w:rPr/>
+              <w:keepNext/>
+              <w:spacing w:before="80" w:after="80"/>
+              <w:jc w:val="center"/>
+            </w:pPr>
+            <w:r/>
+            <w:r>
+              <w:drawing>
+                <wp:inline xmlns:a="http://schemas.openxmlformats.org/drawingml/2006/main" xmlns:pic="http://schemas.openxmlformats.org/drawingml/2006/picture">
+                  <wp:extent cx="5669280" cy="3731065"/>
+                  <wp:docPr id="1" name="Picture 1"/>
+                  <wp:cNvGraphicFramePr>
+                    <a:graphicFrameLocks noChangeAspect="1"/>
+                  </wp:cNvGraphicFramePr>
+                  <a:graphic>
+                    <a:graphicData uri="http://schemas.openxmlformats.org/drawingml/2006/picture">
+                      <pic:pic>
+                        <pic:nvPicPr>
+                          <pic:cNvPr id="0" name="p098_product_architecture_flowchart.png"/>
+                          <pic:cNvPicPr/>
+                        </pic:nvPicPr>
+                        <pic:blipFill>
+                          <a:blip r:embed="rId9"/>
+                          <a:stretch>
+                            <a:fillRect/>
+                          </a:stretch>
+                        </pic:blipFill>
+                        <pic:spPr>
+                          <a:xfrm>
+                            <a:off x="0" y="0"/>
+                            <a:ext cx="5669280" cy="3731065"/>
+                          </a:xfrm>
+                          <a:prstGeom prst="rect"/>
+                        </pic:spPr>
+                      </pic:pic>
+                    </a:graphicData>
+                  </a:graphic>
+                </wp:inline>
+              </w:drawing>
+            </w:r>
+          </w:p>
+          <w:p>
+            <w:pPr>
+              <w:spacing w:before="80" w:after="120" w:line="276" w:lineRule="auto"/>
+              <w:jc w:val="center"/>
             </w:pPr>
             <w:r>
               <w:rPr>
-                <w:rFonts w:ascii="Consolas" w:hAnsi="Consolas"/>
-                <w:color w:val="2B2D42"/>
-                <w:sz w:val="16"/>
+                <w:rFonts w:ascii="Arial" w:hAnsi="Arial"/>
+                <w:b/>
+                <w:color w:val="4B6B94"/>
+                <w:sz w:val="19"/>
               </w:rPr>
-              <w:t>+-----------------------------------------------------------------------------------------+</w:t>
+              <w:t>Figure 2.1: High-Level Product Architecture of P_098 Emotion Detection System</w:t>
               <w:br/>
-              <w:t>|                             SYSTEM CONTEXT ARCHITECTURE                                 |</w:t>
-              <w:br/>
-              <w:t>+-----------------------------------------------------------------------------------------+</w:t>
-              <w:br/>
-              <w:t>|  [ End User / CX Lead ]        [ Automated REST Client ]       [ Compliance Auditor ]   |</w:t>
-              <w:br/>
-              <w:t>|             |                              |                              |             |</w:t>
-              <w:br/>
-              <w:t>|             v                              v                              v             |</w:t>
-              <w:br/>
-              <w:t>|  +-----------------------------------------------------------------------------------+  |</w:t>
-              <w:br/>
-              <w:t>|  |                      PRESENTATION &amp; API GATEWAY (Flask 3.0)                       |  |</w:t>
-              <w:br/>
-              <w:t>|  |     GET / (Dashboard)    POST /process    POST /batch    GET /inspect (Auditor)   |  |</w:t>
-              <w:br/>
-              <w:t>|  +-----------------------------------------------------------------------------------+  |</w:t>
-              <w:br/>
-              <w:t>|                                            |                                            |</w:t>
-              <w:br/>
-              <w:t>|                                            v                                            |</w:t>
-              <w:br/>
-              <w:t>|  +-----------------------------------------------------------------------------------+  |</w:t>
-              <w:br/>
-              <w:t>|  |                               HYBRID AI CORE ENGINE                               |  |</w:t>
-              <w:br/>
-              <w:t>|  |  [Input Validator] -&gt; [Preprocessor] -&gt; [Parallel Extraction: Rules, Models, RAG]  |  |</w:t>
-              <w:br/>
-              <w:t>|  |  [DistilRoBERTa 7-Class Emotion]  +  [cardiffnlp/twitter-roberta-base-irony]       |  |</w:t>
-              <w:br/>
-              <w:t>|  |  -&gt; [Mathematical Signal Fusion (70/15/15) + Incongruity Calibration + Purity Guard] |</w:t>
-              <w:br/>
-              <w:t>|  |  -&gt; [Bounded Gemini LLM Rationale Synthesis with Offline Template Fallback]       |  |</w:t>
-              <w:br/>
-              <w:t>|  |  -&gt; [Output Safety Shield &amp; Clinical Redactor]                                    |  |</w:t>
-              <w:br/>
-              <w:t>|  +-----------------------------------------------------------------------------------+  |</w:t>
-              <w:br/>
-              <w:t>|                                            |                                            |</w:t>
-              <w:br/>
-              <w:t>|                                            v                                            |</w:t>
-              <w:br/>
-              <w:t>|  +-----------------------------------------------------------------------------------+  |</w:t>
-              <w:br/>
-              <w:t>|  |                              STORAGE &amp; KNOWLEDGE BASE                             |  |</w:t>
-              <w:br/>
-              <w:t>|  |      SQLite3 (emotion.sqlite3)       exemplars.jsonl       emotions.jsonl         |  |</w:t>
-              <w:br/>
-              <w:t>|  +-----------------------------------------------------------------------------------+  |</w:t>
-              <w:br/>
-              <w:t>+-----------------------------------------------------------------------------------------+</w:t>
+            </w:r>
+            <w:r>
+              <w:rPr>
+                <w:rFonts w:ascii="Arial" w:hAnsi="Arial"/>
+                <w:i/>
+                <w:color w:val="7A8290"/>
+                <w:sz w:val="17"/>
+              </w:rPr>
+              <w:t>End-to-end multi-tier pipeline showing Web Dashboard input, Flask 3.0 API Gateway &amp; Router, five parallel extraction engines (DistilRoBERTa 7-Class Emotion, Twitter-RoBERTa-Irony, Lexical/Rule Engine, Semantic Vector RAG, and SQLite 3 persistence), Mathematical Signal Fusion Layer (70/15/15) with Affective Purity Guards &amp; Contextual Incongruity Calibration, Bounded Gemini LLM Rationale Synthesis, and calibrated prediction return loop.</w:t>
             </w:r>
           </w:p>
         </w:tc>
@@ -4302,7 +4315,12 @@
         <w:rPr/>
       </w:pPr>
       <w:r>
-        <w:t>The interface will follow standard UX usability best practices (clean navigation bar, breadcrumbs, modal validation dialogs). All forms must provide immediate visual feedback (success banners or inline error alerts under erroneous fields).</w:t>
+        <w:rPr>
+          <w:rFonts w:ascii="Arial" w:hAnsi="Arial"/>
+          <w:color w:val="2B2D42"/>
+          <w:sz w:val="20"/>
+        </w:rPr>
+        <w:t>The interface follows standard UX usability best practices (clean top navigation bar, intuitive dual-pane layout, and immediate visual feedback). All interactive controls provide real-time validation, color-coded emotion badges, posterior probability distribution bars, and route telemetry strips, as illustrated in the interface architecture wireframe in Figure 4.1.</w:t>
       </w:r>
     </w:p>
     <w:tbl>
@@ -4311,6 +4329,14 @@
         <w:jc w:val="center"/>
         <w:tblLayout w:type="fixed"/>
         <w:tblLook w:val="04A0" w:firstRow="1" w:lastRow="0" w:firstColumn="1" w:lastColumn="0" w:noHBand="0" w:noVBand="1"/>
+        <w:tblBorders>
+          <w:top w:val="none" w:sz="0" w:space="0" w:color="auto"/>
+          <w:left w:val="none" w:sz="0" w:space="0" w:color="auto"/>
+          <w:bottom w:val="none" w:sz="0" w:space="0" w:color="auto"/>
+          <w:right w:val="none" w:sz="0" w:space="0" w:color="auto"/>
+          <w:insideH w:val="none" w:sz="0" w:space="0" w:color="auto"/>
+          <w:insideV w:val="none" w:sz="0" w:space="0" w:color="auto"/>
+        </w:tblBorders>
       </w:tblPr>
       <w:tblGrid>
         <w:gridCol w:w="9360"/>
@@ -4338,47 +4364,69 @@
           </w:tcPr>
           <w:p>
             <w:pPr>
-              <w:pStyle w:val="style0"/>
-              <w:spacing w:before="40" w:after="40" w:lineRule="auto" w:line="276"/>
-              <w:rPr/>
+              <w:keepNext/>
+              <w:spacing w:before="80" w:after="80"/>
+              <w:jc w:val="center"/>
+            </w:pPr>
+            <w:r/>
+            <w:r>
+              <w:drawing>
+                <wp:inline xmlns:a="http://schemas.openxmlformats.org/drawingml/2006/main" xmlns:pic="http://schemas.openxmlformats.org/drawingml/2006/picture">
+                  <wp:extent cx="5669280" cy="3665699"/>
+                  <wp:docPr id="2" name="Picture 2"/>
+                  <wp:cNvGraphicFramePr>
+                    <a:graphicFrameLocks noChangeAspect="1"/>
+                  </wp:cNvGraphicFramePr>
+                  <a:graphic>
+                    <a:graphicData uri="http://schemas.openxmlformats.org/drawingml/2006/picture">
+                      <pic:pic>
+                        <pic:nvPicPr>
+                          <pic:cNvPr id="0" name="p098_ui_wireframe_diagram.png"/>
+                          <pic:cNvPicPr/>
+                        </pic:nvPicPr>
+                        <pic:blipFill>
+                          <a:blip r:embed="rId10"/>
+                          <a:stretch>
+                            <a:fillRect/>
+                          </a:stretch>
+                        </pic:blipFill>
+                        <pic:spPr>
+                          <a:xfrm>
+                            <a:off x="0" y="0"/>
+                            <a:ext cx="5669280" cy="3665699"/>
+                          </a:xfrm>
+                          <a:prstGeom prst="rect"/>
+                        </pic:spPr>
+                      </pic:pic>
+                    </a:graphicData>
+                  </a:graphic>
+                </wp:inline>
+              </w:drawing>
+            </w:r>
+          </w:p>
+          <w:p>
+            <w:pPr>
+              <w:spacing w:before="80" w:after="120" w:line="276" w:lineRule="auto"/>
+              <w:jc w:val="center"/>
             </w:pPr>
             <w:r>
               <w:rPr>
-                <w:rFonts w:ascii="Consolas" w:hAnsi="Consolas"/>
-                <w:color w:val="2B2D42"/>
-                <w:sz w:val="16"/>
+                <w:rFonts w:ascii="Arial" w:hAnsi="Arial"/>
+                <w:b/>
+                <w:color w:val="4B6B94"/>
+                <w:sz w:val="19"/>
               </w:rPr>
-              <w:t>+-----------------------------------------------------------------------------------------+</w:t>
+              <w:t>Figure 4.1: Interactive Operator Dashboard and Pipeline Output Interface Architecture</w:t>
               <w:br/>
-              <w:t>|  P_098 Emotion Detection  |  HCL Training  |  Divyansh Yadav      [Dashboard]  [Inspect]    |</w:t>
-              <w:br/>
-              <w:t>+-----------------------------------------------------------------------------------------+</w:t>
-              <w:br/>
-              <w:t>|  INPUT ANALYSIS                                   |  PIPELINE OUTPUT                    |</w:t>
-              <w:br/>
-              <w:t>|  Enter text:                                      |  Primary Emotion:  [ 😢 Sadness ]   |</w:t>
-              <w:br/>
-              <w:t>|  [ It was a bad day for me                     ]  |  Confidence:       [ 94.9% ]        |</w:t>
-              <w:br/>
-              <w:t>|                                                   |  Sarcasm Alert:    [ None (0.02) ]  |</w:t>
-              <w:br/>
-              <w:t>|  Presets: [Joy] [Sarcasm] [Frustration] [Uncertain|  Probability Distribution:           |</w:t>
-              <w:br/>
-              <w:t>|                                                   |  Sadness  ==================== 94.9%|</w:t>
-              <w:br/>
-              <w:t>|  [  ANALYZE EMOTION  ]                            |  Fear     = 2.5%                    |</w:t>
-              <w:br/>
-              <w:t>|                                                   |  Joy      &lt; 0.5%                    |</w:t>
-              <w:br/>
-              <w:t>|  -----------------------------------------------  |  ---------------------------------  |</w:t>
-              <w:br/>
-              <w:t>|  BATCH CSV ANALYSIS                               |  Grounded Explanation:              |</w:t>
-              <w:br/>
-              <w:t>|  [Choose CSV File]  [Run Batch Analysis]          |  "The text directly conveys gloom   |</w:t>
-              <w:br/>
-              <w:t>|                                                   |   and distress via 'bad day'...'    |</w:t>
-              <w:br/>
-              <w:t>+-----------------------------------------------------------------------------------------+</w:t>
+            </w:r>
+            <w:r>
+              <w:rPr>
+                <w:rFonts w:ascii="Arial" w:hAnsi="Arial"/>
+                <w:i/>
+                <w:color w:val="7A8290"/>
+                <w:sz w:val="17"/>
+              </w:rPr>
+              <w:t>Production dual-pane user interface layout: Left Panel provides interactive utterance input, one-click sentiment presets, and CSV batch ingestion drop-zone; Right Panel displays primary emotion badge, sarcasm/irony intensity alert, 7-class posterior probability distribution bars, evidence-grounded rationale with RAG knowledge citations, and real-time execution route telemetry.</w:t>
             </w:r>
           </w:p>
         </w:tc>
@@ -5505,7 +5553,7 @@
         <w:drawing>
           <wp:inline xmlns:a="http://schemas.openxmlformats.org/drawingml/2006/main" xmlns:pic="http://schemas.openxmlformats.org/drawingml/2006/picture">
             <wp:extent cx="5486400" cy="3645326"/>
-            <wp:docPr id="1" name="Picture 1"/>
+            <wp:docPr id="3" name="Picture 3"/>
             <wp:cNvGraphicFramePr>
               <a:graphicFrameLocks noChangeAspect="1"/>
             </wp:cNvGraphicFramePr>
@@ -5517,7 +5565,7 @@
                     <pic:cNvPicPr/>
                   </pic:nvPicPr>
                   <pic:blipFill>
-                    <a:blip r:embed="rId9"/>
+                    <a:blip r:embed="rId11"/>
                     <a:stretch>
                       <a:fillRect/>
                     </a:stretch>
@@ -5577,7 +5625,7 @@
         <w:drawing>
           <wp:inline xmlns:a="http://schemas.openxmlformats.org/drawingml/2006/main" xmlns:pic="http://schemas.openxmlformats.org/drawingml/2006/picture">
             <wp:extent cx="5486400" cy="4696990"/>
-            <wp:docPr id="2" name="Picture 2"/>
+            <wp:docPr id="4" name="Picture 4"/>
             <wp:cNvGraphicFramePr>
               <a:graphicFrameLocks noChangeAspect="1"/>
             </wp:cNvGraphicFramePr>
@@ -5589,7 +5637,7 @@
                     <pic:cNvPicPr/>
                   </pic:nvPicPr>
                   <pic:blipFill>
-                    <a:blip r:embed="rId10"/>
+                    <a:blip r:embed="rId12"/>
                     <a:stretch>
                       <a:fillRect/>
                     </a:stretch>
@@ -5649,7 +5697,7 @@
         <w:drawing>
           <wp:inline xmlns:a="http://schemas.openxmlformats.org/drawingml/2006/main" xmlns:pic="http://schemas.openxmlformats.org/drawingml/2006/picture">
             <wp:extent cx="5486400" cy="2286000"/>
-            <wp:docPr id="3" name="Picture 3"/>
+            <wp:docPr id="5" name="Picture 5"/>
             <wp:cNvGraphicFramePr>
               <a:graphicFrameLocks noChangeAspect="1"/>
             </wp:cNvGraphicFramePr>
@@ -5661,7 +5709,7 @@
                     <pic:cNvPicPr/>
                   </pic:nvPicPr>
                   <pic:blipFill>
-                    <a:blip r:embed="rId11"/>
+                    <a:blip r:embed="rId13"/>
                     <a:stretch>
                       <a:fillRect/>
                     </a:stretch>

</xml_diff>